<commit_message>
BA Part 4 (AI): add INVEST letter tags to the DoR artifact
Co-Authored-By: Claude Sonnet 5.5 <noreply@anthropic.com>
</commit_message>
<xml_diff>
--- a/BA/Part 4_Requirements Documentation-20260912/Done/AI/Artifacts/2. DoR_DoD_VNS.docx
+++ b/BA/Part 4_Requirements Documentation-20260912/Done/AI/Artifacts/2. DoR_DoD_VNS.docx
@@ -1,55 +1,48 @@
 
 <file path=word/document.xml><?xml version="1.0" encoding="utf-8"?>
-<w:document xmlns:wpc="http://schemas.microsoft.com/office/word/2010/wordprocessingCanvas" xmlns:cx="http://schemas.microsoft.com/office/drawing/2014/chartex" xmlns:cx1="http://schemas.microsoft.com/office/drawing/2015/9/8/chartex" xmlns:cx2="http://schemas.microsoft.com/office/drawing/2015/10/21/chartex" xmlns:cx3="http://schemas.microsoft.com/office/drawing/2016/5/9/chartex" xmlns:cx4="http://schemas.microsoft.com/office/drawing/2016/5/10/chartex" xmlns:cx5="http://schemas.microsoft.com/office/drawing/2016/5/11/chartex" xmlns:cx6="http://schemas.microsoft.com/office/drawing/2016/5/12/chartex" xmlns:cx7="http://schemas.microsoft.com/office/drawing/2016/5/13/chartex" xmlns:cx8="http://schemas.microsoft.com/office/drawing/2016/5/14/chartex" xmlns:mc="http://schemas.openxmlformats.org/markup-compatibility/2006" xmlns:aink="http://schemas.microsoft.com/office/drawing/2016/ink" xmlns:am3d="http://schemas.microsoft.com/office/drawing/2017/model3d" xmlns:o="urn:schemas-microsoft-com:office:office" xmlns:oel="http://schemas.microsoft.com/office/2019/extlst" xmlns:r="http://schemas.openxmlformats.org/officeDocument/2006/relationships" xmlns:m="http://schemas.openxmlformats.org/officeDocument/2006/math" xmlns:v="urn:schemas-microsoft-com:vml" xmlns:wp14="http://schemas.microsoft.com/office/word/2010/wordprocessingDrawing" xmlns:wp="http://schemas.openxmlformats.org/drawingml/2006/wordprocessingDrawing" xmlns:w10="urn:schemas-microsoft-com:office:word" xmlns:w="http://schemas.openxmlformats.org/wordprocessingml/2006/main" xmlns:w14="http://schemas.microsoft.com/office/word/2010/wordml" xmlns:w15="http://schemas.microsoft.com/office/word/2012/wordml" xmlns:w16cex="http://schemas.microsoft.com/office/word/2018/wordml/cex" xmlns:w16cid="http://schemas.microsoft.com/office/word/2016/wordml/cid" xmlns:w16="http://schemas.microsoft.com/office/word/2018/wordml" xmlns:w16sdtdh="http://schemas.microsoft.com/office/word/2020/wordml/sdtdatahash" xmlns:w16se="http://schemas.microsoft.com/office/word/2015/wordml/symex" xmlns:wpg="http://schemas.microsoft.com/office/word/2010/wordprocessingGroup" xmlns:wpi="http://schemas.microsoft.com/office/word/2010/wordprocessingInk" xmlns:wne="http://schemas.microsoft.com/office/word/2006/wordml" xmlns:wps="http://schemas.microsoft.com/office/word/2010/wordprocessingShape" mc:Ignorable="w14 w15 w16se w16cid w16 w16cex w16sdtdh wp14">
+<w:document xmlns:wpc="http://schemas.microsoft.com/office/word/2010/wordprocessingCanvas" xmlns:mc="http://schemas.openxmlformats.org/markup-compatibility/2006" xmlns:o="urn:schemas-microsoft-com:office:office" xmlns:r="http://schemas.openxmlformats.org/officeDocument/2006/relationships" xmlns:m="http://schemas.openxmlformats.org/officeDocument/2006/math" xmlns:v="urn:schemas-microsoft-com:vml" xmlns:wp14="http://schemas.microsoft.com/office/word/2010/wordprocessingDrawing" xmlns:wp="http://schemas.openxmlformats.org/drawingml/2006/wordprocessingDrawing" xmlns:w10="urn:schemas-microsoft-com:office:word" xmlns:w="http://schemas.openxmlformats.org/wordprocessingml/2006/main" xmlns:w14="http://schemas.microsoft.com/office/word/2010/wordml" xmlns:w15="http://schemas.microsoft.com/office/word/2012/wordml" xmlns:w16se="http://schemas.microsoft.com/office/word/2015/wordml/symex" xmlns:w16cid="http://schemas.microsoft.com/office/word/2016/wordml/cid" xmlns:w16="http://schemas.microsoft.com/office/word/2018/wordml" xmlns:w16cex="http://schemas.microsoft.com/office/word/2018/wordml/cex" xmlns:w16sdtdh="http://schemas.microsoft.com/office/word/2020/wordml/sdtdatahash" xmlns:wne="http://schemas.microsoft.com/office/word/2006/wordml" xmlns:wpg="http://schemas.microsoft.com/office/word/2010/wordprocessingGroup" xmlns:wps="http://schemas.microsoft.com/office/word/2010/wordprocessingShape" mc:Ignorable="w14 w15 w16se w16cid w16 w16cex w16sdtdh wp14">
   <w:body>
     <w:p>
       <w:pPr>
         <w:jc w:val="center"/>
         <w:rPr>
-          <w:rFonts w:ascii="Times New Roman" w:hAnsi="Times New Roman" w:eastAsia="Calibri" w:cs="Times New Roman" w:asciiTheme="minorAscii" w:hAnsiTheme="minorAscii" w:eastAsiaTheme="minorAscii" w:cstheme="minorBidi"/>
-          <w:b w:val="1"/>
-          <w:bCs w:val="1"/>
+          <w:rFonts w:ascii="Times New Roman" w:hAnsi="Times New Roman" w:eastAsia="Calibri" w:cs="Times New Roman" w:asciiTheme="minorAscii" w:hAnsiTheme="minorAscii" w:eastAsiaTheme="minorAscii" w:csTheme="minorBidi"/>
+          <w:b/>
+          <w:bCs/>
           <w:color w:val="auto"/>
           <w:sz w:val="40"/>
           <w:szCs w:val="40"/>
-          <w:lang w:eastAsia="en-US" w:bidi="ar-SA"/>
         </w:rPr>
       </w:pPr>
       <w:r>
         <w:rPr>
-          <w:rFonts w:ascii="Times New Roman" w:hAnsi="Times New Roman" w:eastAsia="Calibri" w:cs="Times New Roman" w:asciiTheme="minorAscii" w:hAnsiTheme="minorAscii" w:eastAsiaTheme="minorAscii" w:cstheme="minorBidi"/>
-          <w:b w:val="1"/>
-          <w:bCs w:val="1"/>
+          <w:rFonts w:ascii="Times New Roman" w:hAnsi="Times New Roman" w:eastAsia="Calibri" w:cs="Times New Roman" w:asciiTheme="minorAscii" w:hAnsiTheme="minorAscii" w:eastAsiaTheme="minorAscii" w:csTheme="minorBidi"/>
+          <w:b/>
+          <w:bCs/>
+          <w:sz w:val="36"/>
+          <w:szCs w:val="36"/>
+        </w:rPr>
+        <w:t>VNS — Custom University Learning Platform · Team «20/80»</w:t>
+      </w:r>
+      <w:r>
+        <w:rPr>
+          <w:rFonts w:ascii="Times New Roman" w:hAnsi="Times New Roman" w:eastAsia="Calibri" w:cs="Times New Roman" w:asciiTheme="minorAscii" w:hAnsiTheme="minorAscii" w:eastAsiaTheme="minorAscii" w:csTheme="minorBidi"/>
+          <w:b/>
+          <w:bCs/>
           <w:color w:val="auto"/>
           <w:sz w:val="36"/>
           <w:szCs w:val="36"/>
-          <w:lang w:eastAsia="en-US" w:bidi="ar-SA"/>
         </w:rPr>
-        <w:t xml:space="preserve">VNS — Custom University Learning Platform · Team «20/80»</w:t>
       </w:r>
       <w:r>
         <w:rPr>
-          <w:rFonts w:ascii="Times New Roman" w:hAnsi="Times New Roman" w:eastAsia="Calibri" w:cs="Times New Roman" w:asciiTheme="minorAscii" w:hAnsiTheme="minorAscii" w:eastAsiaTheme="minorAscii" w:cstheme="minorBidi"/>
-          <w:b w:val="1"/>
-          <w:bCs w:val="1"/>
+          <w:rFonts w:ascii="Times New Roman" w:hAnsi="Times New Roman" w:eastAsia="Calibri" w:cs="Times New Roman" w:asciiTheme="minorAscii" w:hAnsiTheme="minorAscii" w:eastAsiaTheme="minorAscii" w:csTheme="minorBidi"/>
+          <w:b/>
+          <w:bCs/>
           <w:color w:val="auto"/>
           <w:sz w:val="36"/>
           <w:szCs w:val="36"/>
-          <w:lang w:eastAsia="en-US" w:bidi="ar-SA"/>
         </w:rPr>
-        <w:t xml:space="preserve"/>
-      </w:r>
-      <w:r>
-        <w:rPr>
-          <w:rFonts w:ascii="Times New Roman" w:hAnsi="Times New Roman" w:eastAsia="Calibri" w:cs="Times New Roman" w:asciiTheme="minorAscii" w:hAnsiTheme="minorAscii" w:eastAsiaTheme="minorAscii" w:cstheme="minorBidi"/>
-          <w:b w:val="1"/>
-          <w:bCs w:val="1"/>
-          <w:color w:val="auto"/>
-          <w:sz w:val="36"/>
-          <w:szCs w:val="36"/>
-          <w:lang w:eastAsia="en-US" w:bidi="ar-SA"/>
-        </w:rPr>
-        <w:t xml:space="preserve"/>
       </w:r>
     </w:p>
     <w:p>
@@ -57,13 +50,12 @@
         <w:pStyle w:val="Normal"/>
         <w:jc w:val="center"/>
         <w:rPr>
-          <w:rFonts w:ascii="Times New Roman" w:hAnsi="Times New Roman" w:eastAsia="Calibri" w:cs="Times New Roman" w:asciiTheme="minorAscii" w:hAnsiTheme="minorAscii" w:eastAsiaTheme="minorAscii" w:cstheme="minorBidi"/>
-          <w:b w:val="1"/>
-          <w:bCs w:val="1"/>
+          <w:rFonts w:ascii="Times New Roman" w:hAnsi="Times New Roman" w:eastAsia="Calibri" w:cs="Times New Roman" w:asciiTheme="minorAscii" w:hAnsiTheme="minorAscii" w:eastAsiaTheme="minorAscii" w:csTheme="minorBidi"/>
+          <w:b/>
+          <w:bCs/>
           <w:color w:val="auto"/>
           <w:sz w:val="36"/>
           <w:szCs w:val="36"/>
-          <w:lang w:eastAsia="en-US" w:bidi="ar-SA"/>
         </w:rPr>
       </w:pPr>
     </w:p>
@@ -79,7 +71,13 @@
           <w:insideH w:val="single" w:sz="4" w:space="0" w:color="000000"/>
           <w:insideV w:val="single" w:sz="4" w:space="0" w:color="000000"/>
         </w:tblBorders>
-        <w:tblLook w:val="04A0" w:firstRow="1" w:lastRow="0" w:firstColumn="1" w:lastColumn="0" w:noHBand="0" w:noVBand="1"/>
+        <w:tblCellMar>
+          <w:top w:w="0" w:type="dxa"/>
+          <w:left w:w="108" w:type="dxa"/>
+          <w:bottom w:w="0" w:type="dxa"/>
+          <w:right w:w="108" w:type="dxa"/>
+        </w:tblCellMar>
+        <w:tblLook w:firstRow="1" w:firstColumn="1" w:noVBand="1"/>
       </w:tblPr>
       <w:tblGrid>
         <w:gridCol w:w="4675"/>
@@ -92,7 +90,19 @@
         <w:tc>
           <w:tcPr>
             <w:tcW w:w="4675" w:type="dxa"/>
-            <w:shd w:val="clear" w:color="auto" w:fill="BDD6EE" w:themeFill="accent5" w:themeFillTint="66"/>
+            <w:tcBorders>
+              <w:top w:val="single" w:sz="4" w:space="0" w:color="000000"/>
+              <w:left w:val="single" w:sz="4" w:space="0" w:color="000000"/>
+              <w:bottom w:val="single" w:sz="4" w:space="0" w:color="000000"/>
+              <w:right w:val="single" w:sz="4" w:space="0" w:color="000000"/>
+            </w:tcBorders>
+            <w:shd w:val="clear" w:themeFill="accent5" w:themeFillTint="66"/>
+            <w:tcMar>
+              <w:top w:w="0" w:type="dxa"/>
+              <w:left w:w="108" w:type="dxa"/>
+              <w:bottom w:w="0" w:type="dxa"/>
+              <w:right w:w="108" w:type="dxa"/>
+            </w:tcMar>
           </w:tcPr>
           <w:p>
             <w:pPr>
@@ -107,7 +117,7 @@
             </w:pPr>
             <w:r>
               <w:rPr>
-                <w:rFonts w:ascii="Times New Roman" w:hAnsi="Times New Roman" w:cs="Times New Roman"/>
+                <w:rFonts w:ascii="Times New Roman" w:hAnsi="Times New Roman" w:eastAsia="Calibri" w:cs="Times New Roman" w:eastAsiaTheme="minorHAnsi"/>
                 <w:b/>
                 <w:bCs/>
                 <w:sz w:val="28"/>
@@ -115,10 +125,9 @@
               </w:rPr>
               <w:t>Definition of Ready (</w:t>
             </w:r>
-            <w:proofErr w:type="spellStart"/>
-            <w:r>
-              <w:rPr>
-                <w:rFonts w:ascii="Times New Roman" w:hAnsi="Times New Roman" w:cs="Times New Roman"/>
+            <w:r>
+              <w:rPr>
+                <w:rFonts w:ascii="Times New Roman" w:hAnsi="Times New Roman" w:eastAsia="Calibri" w:cs="Times New Roman" w:eastAsiaTheme="minorHAnsi"/>
                 <w:b/>
                 <w:bCs/>
                 <w:sz w:val="28"/>
@@ -126,10 +135,9 @@
               </w:rPr>
               <w:t>DoR</w:t>
             </w:r>
-            <w:proofErr w:type="spellEnd"/>
-            <w:r>
-              <w:rPr>
-                <w:rFonts w:ascii="Times New Roman" w:hAnsi="Times New Roman" w:cs="Times New Roman"/>
+            <w:r>
+              <w:rPr>
+                <w:rFonts w:ascii="Times New Roman" w:hAnsi="Times New Roman" w:eastAsia="Calibri" w:cs="Times New Roman" w:eastAsiaTheme="minorHAnsi"/>
                 <w:b/>
                 <w:bCs/>
                 <w:sz w:val="28"/>
@@ -142,7 +150,19 @@
         <w:tc>
           <w:tcPr>
             <w:tcW w:w="4675" w:type="dxa"/>
-            <w:shd w:val="clear" w:color="auto" w:fill="BDD6EE" w:themeFill="accent5" w:themeFillTint="66"/>
+            <w:tcBorders>
+              <w:top w:val="single" w:sz="4" w:space="0" w:color="000000"/>
+              <w:left w:val="single" w:sz="4" w:space="0" w:color="000000"/>
+              <w:bottom w:val="single" w:sz="4" w:space="0" w:color="000000"/>
+              <w:right w:val="single" w:sz="4" w:space="0" w:color="000000"/>
+            </w:tcBorders>
+            <w:shd w:val="clear" w:themeFill="accent5" w:themeFillTint="66"/>
+            <w:tcMar>
+              <w:top w:w="0" w:type="dxa"/>
+              <w:left w:w="108" w:type="dxa"/>
+              <w:bottom w:w="0" w:type="dxa"/>
+              <w:right w:w="108" w:type="dxa"/>
+            </w:tcMar>
           </w:tcPr>
           <w:p>
             <w:pPr>
@@ -156,7 +176,7 @@
             </w:pPr>
             <w:r>
               <w:rPr>
-                <w:rFonts w:ascii="Times New Roman" w:hAnsi="Times New Roman" w:cs="Times New Roman"/>
+                <w:rFonts w:ascii="Times New Roman" w:hAnsi="Times New Roman" w:eastAsia="Calibri" w:cs="Times New Roman" w:eastAsiaTheme="minorHAnsi"/>
                 <w:b/>
                 <w:bCs/>
                 <w:sz w:val="28"/>
@@ -171,15 +191,171 @@
         <w:tc>
           <w:tcPr>
             <w:tcW w:w="4675" w:type="dxa"/>
+            <w:tcBorders>
+              <w:top w:val="single" w:sz="4" w:space="0" w:color="000000"/>
+              <w:left w:val="single" w:sz="4" w:space="0" w:color="000000"/>
+              <w:bottom w:val="single" w:sz="4" w:space="0" w:color="000000"/>
+              <w:right w:val="single" w:sz="4" w:space="0" w:color="000000"/>
+            </w:tcBorders>
+            <w:tcMar>
+              <w:top w:w="0" w:type="dxa"/>
+              <w:left w:w="108" w:type="dxa"/>
+              <w:bottom w:w="0" w:type="dxa"/>
+              <w:right w:w="108" w:type="dxa"/>
+            </w:tcMar>
           </w:tcPr>
           <w:p>
             <w:pPr>
               <w:rPr>
                 <w:rFonts w:ascii="Times New Roman" w:hAnsi="Times New Roman" w:cs="Times New Roman"/>
-                <w:sz w:val="24"/>
-                <w:szCs w:val="24"/>
-              </w:rPr>
-            </w:pPr>
+                <w:sz w:val="22"/>
+                <w:szCs w:val="22"/>
+              </w:rPr>
+            </w:pPr>
+          </w:p>
+          <w:p>
+            <w:pPr>
+              <w:spacing w:after="120"/>
+              <w:jc w:val="both"/>
+              <w:rPr>
+                <w:i/>
+                <w:iCs/>
+                <w:sz w:val="20"/>
+                <w:szCs w:val="20"/>
+              </w:rPr>
+            </w:pPr>
+            <w:r>
+              <w:rPr>
+                <w:rFonts w:ascii="Times New Roman" w:hAnsi="Times New Roman" w:cs="Times New Roman"/>
+                <w:b/>
+                <w:bCs/>
+                <w:i/>
+                <w:iCs/>
+                <w:sz w:val="20"/>
+                <w:szCs w:val="20"/>
+              </w:rPr>
+              <w:t xml:space="preserve">I</w:t>
+            </w:r>
+            <w:r>
+              <w:rPr>
+                <w:rFonts w:ascii="Times New Roman" w:hAnsi="Times New Roman" w:cs="Times New Roman"/>
+                <w:i/>
+                <w:iCs/>
+                <w:sz w:val="20"/>
+                <w:szCs w:val="20"/>
+              </w:rPr>
+              <w:t xml:space="preserve"> (Independent), </w:t>
+            </w:r>
+            <w:r>
+              <w:rPr>
+                <w:rFonts w:ascii="Times New Roman" w:hAnsi="Times New Roman" w:cs="Times New Roman"/>
+                <w:b/>
+                <w:bCs/>
+                <w:i/>
+                <w:iCs/>
+                <w:sz w:val="20"/>
+                <w:szCs w:val="20"/>
+              </w:rPr>
+              <w:t xml:space="preserve">N</w:t>
+            </w:r>
+            <w:r>
+              <w:rPr>
+                <w:rFonts w:ascii="Times New Roman" w:hAnsi="Times New Roman" w:cs="Times New Roman"/>
+                <w:i/>
+                <w:iCs/>
+                <w:sz w:val="20"/>
+                <w:szCs w:val="20"/>
+              </w:rPr>
+              <w:t xml:space="preserve"> (Negotiable), </w:t>
+            </w:r>
+            <w:r>
+              <w:rPr>
+                <w:rFonts w:ascii="Times New Roman" w:hAnsi="Times New Roman" w:cs="Times New Roman"/>
+                <w:b/>
+                <w:bCs/>
+                <w:i/>
+                <w:iCs/>
+                <w:sz w:val="20"/>
+                <w:szCs w:val="20"/>
+              </w:rPr>
+              <w:t xml:space="preserve">V</w:t>
+            </w:r>
+            <w:r>
+              <w:rPr>
+                <w:rFonts w:ascii="Times New Roman" w:hAnsi="Times New Roman" w:cs="Times New Roman"/>
+                <w:i/>
+                <w:iCs/>
+                <w:sz w:val="20"/>
+                <w:szCs w:val="20"/>
+              </w:rPr>
+              <w:t xml:space="preserve"> (Valuable), </w:t>
+            </w:r>
+            <w:r>
+              <w:rPr>
+                <w:rFonts w:ascii="Times New Roman" w:hAnsi="Times New Roman" w:cs="Times New Roman"/>
+                <w:b/>
+                <w:bCs/>
+                <w:i/>
+                <w:iCs/>
+                <w:sz w:val="20"/>
+                <w:szCs w:val="20"/>
+              </w:rPr>
+              <w:t xml:space="preserve">E</w:t>
+            </w:r>
+            <w:r>
+              <w:rPr>
+                <w:rFonts w:ascii="Times New Roman" w:hAnsi="Times New Roman" w:cs="Times New Roman"/>
+                <w:i/>
+                <w:iCs/>
+                <w:sz w:val="20"/>
+                <w:szCs w:val="20"/>
+              </w:rPr>
+              <w:t xml:space="preserve"> (Estimable), </w:t>
+            </w:r>
+            <w:r>
+              <w:rPr>
+                <w:rFonts w:ascii="Times New Roman" w:hAnsi="Times New Roman" w:cs="Times New Roman"/>
+                <w:b/>
+                <w:bCs/>
+                <w:i/>
+                <w:iCs/>
+                <w:sz w:val="20"/>
+                <w:szCs w:val="20"/>
+              </w:rPr>
+              <w:t xml:space="preserve">S</w:t>
+            </w:r>
+            <w:r>
+              <w:rPr>
+                <w:rFonts w:ascii="Times New Roman" w:hAnsi="Times New Roman" w:cs="Times New Roman"/>
+                <w:i/>
+                <w:iCs/>
+                <w:sz w:val="20"/>
+                <w:szCs w:val="20"/>
+              </w:rPr>
+              <w:t xml:space="preserve"> (Small), </w:t>
+            </w:r>
+            <w:r>
+              <w:rPr>
+                <w:rFonts w:ascii="Times New Roman" w:hAnsi="Times New Roman" w:cs="Times New Roman"/>
+                <w:b/>
+                <w:bCs/>
+                <w:i/>
+                <w:iCs/>
+                <w:sz w:val="20"/>
+                <w:szCs w:val="20"/>
+              </w:rPr>
+              <w:t xml:space="preserve">T</w:t>
+            </w:r>
+            <w:r>
+              <w:rPr>
+                <w:rFonts w:ascii="Times New Roman" w:hAnsi="Times New Roman" w:cs="Times New Roman"/>
+                <w:i/>
+                <w:iCs/>
+                <w:sz w:val="20"/>
+                <w:szCs w:val="20"/>
+              </w:rPr>
+              <w:t xml:space="preserve"> (Testable)</w:t>
+            </w:r>
           </w:p>
           <w:p>
             <w:pPr>
@@ -188,20 +364,33 @@
                 <w:numId w:val="1"/>
               </w:numPr>
               <w:spacing w:after="80"/>
+              <w:ind w:left="426" w:hanging="426"/>
               <w:jc w:val="both"/>
               <w:rPr>
                 <w:rFonts w:ascii="Times New Roman" w:hAnsi="Times New Roman" w:cs="Times New Roman"/>
-                <w:sz w:val="24"/>
-                <w:szCs w:val="24"/>
-              </w:rPr>
-            </w:pPr>
-            <w:r>
-              <w:rPr>
-                <w:rFonts w:ascii="Times New Roman" w:hAnsi="Times New Roman" w:cs="Times New Roman"/>
-                <w:sz w:val="24"/>
-                <w:szCs w:val="24"/>
-              </w:rPr>
-              <w:t xml:space="preserve">The story is written as “As a [role], I want [feature], so that [value]”, and the role is a real user of the platform: student, lecturer, dean’s office specialist or administrator.</w:t>
+                <w:sz w:val="22"/>
+                <w:szCs w:val="22"/>
+              </w:rPr>
+            </w:pPr>
+            <w:r>
+              <w:rPr>
+                <w:rFonts w:ascii="Times New Roman" w:hAnsi="Times New Roman" w:eastAsia="Calibri" w:cs="Times New Roman" w:eastAsiaTheme="minorHAnsi"/>
+                <w:sz w:val="22"/>
+                <w:szCs w:val="22"/>
+              </w:rPr>
+              <w:t>The story is written as “As a [role], I want [feature], so that [value]”, and the role is a real user of the platform: student, lecturer, dean’s office specialist or administrator.</w:t>
+            </w:r>
+            <w:r>
+              <w:rPr>
+                <w:rFonts w:ascii="Times New Roman" w:hAnsi="Times New Roman" w:cs="Times New Roman"/>
+                <w:b/>
+                <w:bCs/>
+                <w:i/>
+                <w:iCs/>
+                <w:sz w:val="22"/>
+                <w:szCs w:val="22"/>
+              </w:rPr>
+              <w:t xml:space="preserve"> (V)</w:t>
             </w:r>
           </w:p>
           <w:p>
@@ -211,20 +400,33 @@
                 <w:numId w:val="1"/>
               </w:numPr>
               <w:spacing w:after="80"/>
+              <w:ind w:left="426" w:hanging="426"/>
               <w:jc w:val="both"/>
               <w:rPr>
                 <w:rFonts w:ascii="Times New Roman" w:hAnsi="Times New Roman" w:cs="Times New Roman"/>
-                <w:sz w:val="24"/>
-                <w:szCs w:val="24"/>
-              </w:rPr>
-            </w:pPr>
-            <w:r>
-              <w:rPr>
-                <w:rFonts w:ascii="Times New Roman" w:hAnsi="Times New Roman" w:cs="Times New Roman"/>
-                <w:sz w:val="24"/>
-                <w:szCs w:val="24"/>
-              </w:rPr>
-              <w:t xml:space="preserve">The story is traced to a requirement in the Requirements Classification and to a user persona from the requirements elicitation.</w:t>
+                <w:sz w:val="22"/>
+                <w:szCs w:val="22"/>
+              </w:rPr>
+            </w:pPr>
+            <w:r>
+              <w:rPr>
+                <w:rFonts w:ascii="Times New Roman" w:hAnsi="Times New Roman" w:eastAsia="Calibri" w:cs="Times New Roman" w:eastAsiaTheme="minorHAnsi"/>
+                <w:sz w:val="22"/>
+                <w:szCs w:val="22"/>
+              </w:rPr>
+              <w:t>The story is traced to a requirement in the Requirements Classification and to a user persona from the requirements elicitation.</w:t>
+            </w:r>
+            <w:r>
+              <w:rPr>
+                <w:rFonts w:ascii="Times New Roman" w:hAnsi="Times New Roman" w:cs="Times New Roman"/>
+                <w:b/>
+                <w:bCs/>
+                <w:i/>
+                <w:iCs/>
+                <w:sz w:val="22"/>
+                <w:szCs w:val="22"/>
+              </w:rPr>
+              <w:t xml:space="preserve"> (V)</w:t>
             </w:r>
           </w:p>
           <w:p>
@@ -234,20 +436,33 @@
                 <w:numId w:val="1"/>
               </w:numPr>
               <w:spacing w:after="80"/>
+              <w:ind w:left="426" w:hanging="426"/>
               <w:jc w:val="both"/>
               <w:rPr>
                 <w:rFonts w:ascii="Times New Roman" w:hAnsi="Times New Roman" w:cs="Times New Roman"/>
-                <w:sz w:val="24"/>
-                <w:szCs w:val="24"/>
-              </w:rPr>
-            </w:pPr>
-            <w:r>
-              <w:rPr>
-                <w:rFonts w:ascii="Times New Roman" w:hAnsi="Times New Roman" w:cs="Times New Roman"/>
-                <w:sz w:val="24"/>
-                <w:szCs w:val="24"/>
-              </w:rPr>
-              <w:t xml:space="preserve">The Product Owner and the team have discussed the story and agreed on its scope; the Product Owner has approved it.</w:t>
+                <w:sz w:val="22"/>
+                <w:szCs w:val="22"/>
+              </w:rPr>
+            </w:pPr>
+            <w:r>
+              <w:rPr>
+                <w:rFonts w:ascii="Times New Roman" w:hAnsi="Times New Roman" w:eastAsia="Calibri" w:cs="Times New Roman" w:eastAsiaTheme="minorHAnsi"/>
+                <w:sz w:val="22"/>
+                <w:szCs w:val="22"/>
+              </w:rPr>
+              <w:t>The Product Owner and the team have discussed the story and agreed on its scope; the Product Owner has approved it.</w:t>
+            </w:r>
+            <w:r>
+              <w:rPr>
+                <w:rFonts w:ascii="Times New Roman" w:hAnsi="Times New Roman" w:cs="Times New Roman"/>
+                <w:b/>
+                <w:bCs/>
+                <w:i/>
+                <w:iCs/>
+                <w:sz w:val="22"/>
+                <w:szCs w:val="22"/>
+              </w:rPr>
+              <w:t xml:space="preserve"> (N)</w:t>
             </w:r>
           </w:p>
           <w:p>
@@ -257,20 +472,33 @@
                 <w:numId w:val="1"/>
               </w:numPr>
               <w:spacing w:after="80"/>
+              <w:ind w:left="426" w:hanging="426"/>
               <w:jc w:val="both"/>
               <w:rPr>
                 <w:rFonts w:ascii="Times New Roman" w:hAnsi="Times New Roman" w:cs="Times New Roman"/>
-                <w:sz w:val="24"/>
-                <w:szCs w:val="24"/>
-              </w:rPr>
-            </w:pPr>
-            <w:r>
-              <w:rPr>
-                <w:rFonts w:ascii="Times New Roman" w:hAnsi="Times New Roman" w:cs="Times New Roman"/>
-                <w:sz w:val="24"/>
-                <w:szCs w:val="24"/>
-              </w:rPr>
-              <w:t xml:space="preserve">The story can be built and tested without other stories of the same sprint; other dependencies (notifications, data import) are named.</w:t>
+                <w:sz w:val="22"/>
+                <w:szCs w:val="22"/>
+              </w:rPr>
+            </w:pPr>
+            <w:r>
+              <w:rPr>
+                <w:rFonts w:ascii="Times New Roman" w:hAnsi="Times New Roman" w:eastAsia="Calibri" w:cs="Times New Roman" w:eastAsiaTheme="minorHAnsi"/>
+                <w:sz w:val="22"/>
+                <w:szCs w:val="22"/>
+              </w:rPr>
+              <w:t>The story can be built and tested without other stories of the same sprint; other dependencies (notifications, data import) are named.</w:t>
+            </w:r>
+            <w:r>
+              <w:rPr>
+                <w:rFonts w:ascii="Times New Roman" w:hAnsi="Times New Roman" w:cs="Times New Roman"/>
+                <w:b/>
+                <w:bCs/>
+                <w:i/>
+                <w:iCs/>
+                <w:sz w:val="22"/>
+                <w:szCs w:val="22"/>
+              </w:rPr>
+              <w:t xml:space="preserve"> (I)</w:t>
             </w:r>
           </w:p>
           <w:p>
@@ -280,20 +508,33 @@
                 <w:numId w:val="1"/>
               </w:numPr>
               <w:spacing w:after="80"/>
+              <w:ind w:left="426" w:hanging="426"/>
               <w:jc w:val="both"/>
               <w:rPr>
                 <w:rFonts w:ascii="Times New Roman" w:hAnsi="Times New Roman" w:cs="Times New Roman"/>
-                <w:sz w:val="24"/>
-                <w:szCs w:val="24"/>
-              </w:rPr>
-            </w:pPr>
-            <w:r>
-              <w:rPr>
-                <w:rFonts w:ascii="Times New Roman" w:hAnsi="Times New Roman" w:cs="Times New Roman"/>
-                <w:sz w:val="24"/>
-                <w:szCs w:val="24"/>
-              </w:rPr>
-              <w:t xml:space="preserve">Wireframes of all screens in the story are ready, and the UI texts (buttons, fields, messages) are agreed.</w:t>
+                <w:sz w:val="22"/>
+                <w:szCs w:val="22"/>
+              </w:rPr>
+            </w:pPr>
+            <w:r>
+              <w:rPr>
+                <w:rFonts w:ascii="Times New Roman" w:hAnsi="Times New Roman" w:eastAsia="Calibri" w:cs="Times New Roman" w:eastAsiaTheme="minorHAnsi"/>
+                <w:sz w:val="22"/>
+                <w:szCs w:val="22"/>
+              </w:rPr>
+              <w:t>Wireframes of all screens in the story are ready, and the UI texts (buttons, fields, messages) are agreed.</w:t>
+            </w:r>
+            <w:r>
+              <w:rPr>
+                <w:rFonts w:ascii="Times New Roman" w:hAnsi="Times New Roman" w:cs="Times New Roman"/>
+                <w:b/>
+                <w:bCs/>
+                <w:i/>
+                <w:iCs/>
+                <w:sz w:val="22"/>
+                <w:szCs w:val="22"/>
+              </w:rPr>
+              <w:t xml:space="preserve"> (E)</w:t>
             </w:r>
           </w:p>
           <w:p>
@@ -303,20 +544,33 @@
                 <w:numId w:val="1"/>
               </w:numPr>
               <w:spacing w:after="80"/>
+              <w:ind w:left="426" w:hanging="426"/>
               <w:jc w:val="both"/>
               <w:rPr>
                 <w:rFonts w:ascii="Times New Roman" w:hAnsi="Times New Roman" w:cs="Times New Roman"/>
-                <w:sz w:val="24"/>
-                <w:szCs w:val="24"/>
-              </w:rPr>
-            </w:pPr>
-            <w:r>
-              <w:rPr>
-                <w:rFonts w:ascii="Times New Roman" w:hAnsi="Times New Roman" w:cs="Times New Roman"/>
-                <w:sz w:val="24"/>
-                <w:szCs w:val="24"/>
-              </w:rPr>
-              <w:t xml:space="preserve">Acceptance criteria are written as BDD scenarios (Given / When / Then) and cover the main case and at least one error or limit case.</w:t>
+                <w:sz w:val="22"/>
+                <w:szCs w:val="22"/>
+              </w:rPr>
+            </w:pPr>
+            <w:r>
+              <w:rPr>
+                <w:rFonts w:ascii="Times New Roman" w:hAnsi="Times New Roman" w:eastAsia="Calibri" w:cs="Times New Roman" w:eastAsiaTheme="minorHAnsi"/>
+                <w:sz w:val="22"/>
+                <w:szCs w:val="22"/>
+              </w:rPr>
+              <w:t>Acceptance criteria are written as BDD scenarios (Given / When / Then) and cover the main case and at least one error or limit case.</w:t>
+            </w:r>
+            <w:r>
+              <w:rPr>
+                <w:rFonts w:ascii="Times New Roman" w:hAnsi="Times New Roman" w:cs="Times New Roman"/>
+                <w:b/>
+                <w:bCs/>
+                <w:i/>
+                <w:iCs/>
+                <w:sz w:val="22"/>
+                <w:szCs w:val="22"/>
+              </w:rPr>
+              <w:t xml:space="preserve"> (T)</w:t>
             </w:r>
           </w:p>
           <w:p>
@@ -326,20 +580,33 @@
                 <w:numId w:val="1"/>
               </w:numPr>
               <w:spacing w:after="80"/>
+              <w:ind w:left="426" w:hanging="426"/>
               <w:jc w:val="both"/>
               <w:rPr>
                 <w:rFonts w:ascii="Times New Roman" w:hAnsi="Times New Roman" w:cs="Times New Roman"/>
-                <w:sz w:val="24"/>
-                <w:szCs w:val="24"/>
-              </w:rPr>
-            </w:pPr>
-            <w:r>
-              <w:rPr>
-                <w:rFonts w:ascii="Times New Roman" w:hAnsi="Times New Roman" w:cs="Times New Roman"/>
-                <w:sz w:val="24"/>
-                <w:szCs w:val="24"/>
-              </w:rPr>
-              <w:t xml:space="preserve">All open questions are answered by the Product Owner or the Business Analyst; nothing is left “to be decided”.</w:t>
+                <w:sz w:val="22"/>
+                <w:szCs w:val="22"/>
+              </w:rPr>
+            </w:pPr>
+            <w:r>
+              <w:rPr>
+                <w:rFonts w:ascii="Times New Roman" w:hAnsi="Times New Roman" w:eastAsia="Calibri" w:cs="Times New Roman" w:eastAsiaTheme="minorHAnsi"/>
+                <w:sz w:val="22"/>
+                <w:szCs w:val="22"/>
+              </w:rPr>
+              <w:t>All open questions are answered by the Product Owner or the Business Analyst; nothing is left “to be decided”.</w:t>
+            </w:r>
+            <w:r>
+              <w:rPr>
+                <w:rFonts w:ascii="Times New Roman" w:hAnsi="Times New Roman" w:cs="Times New Roman"/>
+                <w:b/>
+                <w:bCs/>
+                <w:i/>
+                <w:iCs/>
+                <w:sz w:val="22"/>
+                <w:szCs w:val="22"/>
+              </w:rPr>
+              <w:t xml:space="preserve"> (E)</w:t>
             </w:r>
           </w:p>
           <w:p>
@@ -349,20 +616,33 @@
                 <w:numId w:val="1"/>
               </w:numPr>
               <w:spacing w:after="80"/>
+              <w:ind w:left="426" w:hanging="426"/>
               <w:jc w:val="both"/>
               <w:rPr>
                 <w:rFonts w:ascii="Times New Roman" w:hAnsi="Times New Roman" w:cs="Times New Roman"/>
-                <w:sz w:val="24"/>
-                <w:szCs w:val="24"/>
-              </w:rPr>
-            </w:pPr>
-            <w:r>
-              <w:rPr>
-                <w:rFonts w:ascii="Times New Roman" w:hAnsi="Times New Roman" w:cs="Times New Roman"/>
-                <w:sz w:val="24"/>
-                <w:szCs w:val="24"/>
-              </w:rPr>
-              <w:t xml:space="preserve">The team has estimated the story in story points, and it fits into one two-week sprint; a larger story is split.</w:t>
+                <w:sz w:val="22"/>
+                <w:szCs w:val="22"/>
+              </w:rPr>
+            </w:pPr>
+            <w:r>
+              <w:rPr>
+                <w:rFonts w:ascii="Times New Roman" w:hAnsi="Times New Roman" w:eastAsia="Calibri" w:cs="Times New Roman" w:eastAsiaTheme="minorHAnsi"/>
+                <w:sz w:val="22"/>
+                <w:szCs w:val="22"/>
+              </w:rPr>
+              <w:t>The team has estimated the story in story points, and it fits into one two-week sprint; a larger story is split.</w:t>
+            </w:r>
+            <w:r>
+              <w:rPr>
+                <w:rFonts w:ascii="Times New Roman" w:hAnsi="Times New Roman" w:cs="Times New Roman"/>
+                <w:b/>
+                <w:bCs/>
+                <w:i/>
+                <w:iCs/>
+                <w:sz w:val="22"/>
+                <w:szCs w:val="22"/>
+              </w:rPr>
+              <w:t xml:space="preserve"> (E, S)</w:t>
             </w:r>
           </w:p>
           <w:p>
@@ -372,33 +652,58 @@
                 <w:numId w:val="1"/>
               </w:numPr>
               <w:spacing w:after="80"/>
+              <w:ind w:left="426" w:hanging="426"/>
               <w:jc w:val="both"/>
               <w:rPr>
                 <w:rFonts w:ascii="Times New Roman" w:hAnsi="Times New Roman" w:cs="Times New Roman"/>
-                <w:sz w:val="24"/>
-                <w:szCs w:val="24"/>
-              </w:rPr>
-            </w:pPr>
-            <w:r>
-              <w:rPr>
-                <w:rFonts w:ascii="Times New Roman" w:hAnsi="Times New Roman" w:cs="Times New Roman"/>
-                <w:sz w:val="24"/>
-                <w:szCs w:val="24"/>
-              </w:rPr>
-              <w:t xml:space="preserve">Test data is ready: several test courses with groups (a lecturer has more than one group), labs with deadlines and maximum points, a lecturer account and student accounts.</w:t>
+                <w:sz w:val="22"/>
+                <w:szCs w:val="22"/>
+              </w:rPr>
+            </w:pPr>
+            <w:r>
+              <w:rPr>
+                <w:rFonts w:ascii="Times New Roman" w:hAnsi="Times New Roman" w:eastAsia="Calibri" w:cs="Times New Roman" w:eastAsiaTheme="minorHAnsi"/>
+                <w:sz w:val="22"/>
+                <w:szCs w:val="22"/>
+              </w:rPr>
+              <w:t>Test data is ready: several test courses with groups (a lecturer has more than one group), labs with deadlines and maximum points, a lecturer account and student accounts.</w:t>
+            </w:r>
+            <w:r>
+              <w:rPr>
+                <w:rFonts w:ascii="Times New Roman" w:hAnsi="Times New Roman" w:cs="Times New Roman"/>
+                <w:b/>
+                <w:bCs/>
+                <w:i/>
+                <w:iCs/>
+                <w:sz w:val="22"/>
+                <w:szCs w:val="22"/>
+              </w:rPr>
+              <w:t xml:space="preserve"> (T)</w:t>
             </w:r>
           </w:p>
         </w:tc>
         <w:tc>
           <w:tcPr>
             <w:tcW w:w="4675" w:type="dxa"/>
+            <w:tcBorders>
+              <w:top w:val="single" w:sz="4" w:space="0" w:color="000000"/>
+              <w:left w:val="single" w:sz="4" w:space="0" w:color="000000"/>
+              <w:bottom w:val="single" w:sz="4" w:space="0" w:color="000000"/>
+              <w:right w:val="single" w:sz="4" w:space="0" w:color="000000"/>
+            </w:tcBorders>
+            <w:tcMar>
+              <w:top w:w="0" w:type="dxa"/>
+              <w:left w:w="108" w:type="dxa"/>
+              <w:bottom w:w="0" w:type="dxa"/>
+              <w:right w:w="108" w:type="dxa"/>
+            </w:tcMar>
           </w:tcPr>
           <w:p>
             <w:pPr>
               <w:rPr>
                 <w:rFonts w:ascii="Times New Roman" w:hAnsi="Times New Roman" w:cs="Times New Roman"/>
-                <w:sz w:val="24"/>
-                <w:szCs w:val="24"/>
+                <w:sz w:val="22"/>
+                <w:szCs w:val="22"/>
               </w:rPr>
             </w:pPr>
           </w:p>
@@ -409,20 +714,21 @@
                 <w:numId w:val="2"/>
               </w:numPr>
               <w:spacing w:after="80"/>
+              <w:ind w:left="426" w:hanging="426"/>
               <w:jc w:val="both"/>
               <w:rPr>
                 <w:rFonts w:ascii="Times New Roman" w:hAnsi="Times New Roman" w:cs="Times New Roman"/>
-                <w:sz w:val="24"/>
-                <w:szCs w:val="24"/>
-              </w:rPr>
-            </w:pPr>
-            <w:r>
-              <w:rPr>
-                <w:rFonts w:ascii="Times New Roman" w:hAnsi="Times New Roman" w:cs="Times New Roman"/>
-                <w:sz w:val="24"/>
-                <w:szCs w:val="24"/>
-              </w:rPr>
-              <w:t xml:space="preserve">All sub-tasks of the story are closed.</w:t>
+                <w:sz w:val="22"/>
+                <w:szCs w:val="22"/>
+              </w:rPr>
+            </w:pPr>
+            <w:r>
+              <w:rPr>
+                <w:rFonts w:ascii="Times New Roman" w:hAnsi="Times New Roman" w:eastAsia="Calibri" w:cs="Times New Roman" w:eastAsiaTheme="minorHAnsi"/>
+                <w:sz w:val="22"/>
+                <w:szCs w:val="22"/>
+              </w:rPr>
+              <w:t>All sub-tasks of the story are closed.</w:t>
             </w:r>
           </w:p>
           <w:p>
@@ -432,20 +738,21 @@
                 <w:numId w:val="2"/>
               </w:numPr>
               <w:spacing w:after="80"/>
+              <w:ind w:left="426" w:hanging="426"/>
               <w:jc w:val="both"/>
               <w:rPr>
                 <w:rFonts w:ascii="Times New Roman" w:hAnsi="Times New Roman" w:cs="Times New Roman"/>
-                <w:sz w:val="24"/>
-                <w:szCs w:val="24"/>
-              </w:rPr>
-            </w:pPr>
-            <w:r>
-              <w:rPr>
-                <w:rFonts w:ascii="Times New Roman" w:hAnsi="Times New Roman" w:cs="Times New Roman"/>
-                <w:sz w:val="24"/>
-                <w:szCs w:val="24"/>
-              </w:rPr>
-              <w:t xml:space="preserve">The code has passed code review, all comments are fixed, and it is merged into the main branch.</w:t>
+                <w:sz w:val="22"/>
+                <w:szCs w:val="22"/>
+              </w:rPr>
+            </w:pPr>
+            <w:r>
+              <w:rPr>
+                <w:rFonts w:ascii="Times New Roman" w:hAnsi="Times New Roman" w:eastAsia="Calibri" w:cs="Times New Roman" w:eastAsiaTheme="minorHAnsi"/>
+                <w:sz w:val="22"/>
+                <w:szCs w:val="22"/>
+              </w:rPr>
+              <w:t>The code has passed code review, all comments are fixed, and it is merged into the main branch.</w:t>
             </w:r>
           </w:p>
           <w:p>
@@ -455,20 +762,21 @@
                 <w:numId w:val="2"/>
               </w:numPr>
               <w:spacing w:after="80"/>
+              <w:ind w:left="426" w:hanging="426"/>
               <w:jc w:val="both"/>
               <w:rPr>
                 <w:rFonts w:ascii="Times New Roman" w:hAnsi="Times New Roman" w:cs="Times New Roman"/>
-                <w:sz w:val="24"/>
-                <w:szCs w:val="24"/>
-              </w:rPr>
-            </w:pPr>
-            <w:r>
-              <w:rPr>
-                <w:rFonts w:ascii="Times New Roman" w:hAnsi="Times New Roman" w:cs="Times New Roman"/>
-                <w:sz w:val="24"/>
-                <w:szCs w:val="24"/>
-              </w:rPr>
-              <w:t xml:space="preserve">The build is successful, and all unit and integration tests pass.</w:t>
+                <w:sz w:val="22"/>
+                <w:szCs w:val="22"/>
+              </w:rPr>
+            </w:pPr>
+            <w:r>
+              <w:rPr>
+                <w:rFonts w:ascii="Times New Roman" w:hAnsi="Times New Roman" w:eastAsia="Calibri" w:cs="Times New Roman" w:eastAsiaTheme="minorHAnsi"/>
+                <w:sz w:val="22"/>
+                <w:szCs w:val="22"/>
+              </w:rPr>
+              <w:t>The build is successful, and all unit and integration tests pass.</w:t>
             </w:r>
           </w:p>
           <w:p>
@@ -478,20 +786,21 @@
                 <w:numId w:val="2"/>
               </w:numPr>
               <w:spacing w:after="80"/>
+              <w:ind w:left="426" w:hanging="426"/>
               <w:jc w:val="both"/>
               <w:rPr>
                 <w:rFonts w:ascii="Times New Roman" w:hAnsi="Times New Roman" w:cs="Times New Roman"/>
-                <w:sz w:val="24"/>
-                <w:szCs w:val="24"/>
-              </w:rPr>
-            </w:pPr>
-            <w:r>
-              <w:rPr>
-                <w:rFonts w:ascii="Times New Roman" w:hAnsi="Times New Roman" w:cs="Times New Roman"/>
-                <w:sz w:val="24"/>
-                <w:szCs w:val="24"/>
-              </w:rPr>
-              <w:t xml:space="preserve">QA has checked every acceptance criterion (Given / When / Then) on the test environment, and all of them pass.</w:t>
+                <w:sz w:val="22"/>
+                <w:szCs w:val="22"/>
+              </w:rPr>
+            </w:pPr>
+            <w:r>
+              <w:rPr>
+                <w:rFonts w:ascii="Times New Roman" w:hAnsi="Times New Roman" w:eastAsia="Calibri" w:cs="Times New Roman" w:eastAsiaTheme="minorHAnsi"/>
+                <w:sz w:val="22"/>
+                <w:szCs w:val="22"/>
+              </w:rPr>
+              <w:t>QA has checked every acceptance criterion (Given / When / Then) on the test environment, and all of them pass.</w:t>
             </w:r>
           </w:p>
           <w:p>
@@ -501,20 +810,21 @@
                 <w:numId w:val="2"/>
               </w:numPr>
               <w:spacing w:after="80"/>
+              <w:ind w:left="426" w:hanging="426"/>
               <w:jc w:val="both"/>
               <w:rPr>
                 <w:rFonts w:ascii="Times New Roman" w:hAnsi="Times New Roman" w:cs="Times New Roman"/>
-                <w:sz w:val="24"/>
-                <w:szCs w:val="24"/>
-              </w:rPr>
-            </w:pPr>
-            <w:r>
-              <w:rPr>
-                <w:rFonts w:ascii="Times New Roman" w:hAnsi="Times New Roman" w:cs="Times New Roman"/>
-                <w:sz w:val="24"/>
-                <w:szCs w:val="24"/>
-              </w:rPr>
-              <w:t xml:space="preserve">The UI matches the wireframe, works on a phone and on a computer and meets WCAG 2.2 AA.</w:t>
+                <w:sz w:val="22"/>
+                <w:szCs w:val="22"/>
+              </w:rPr>
+            </w:pPr>
+            <w:r>
+              <w:rPr>
+                <w:rFonts w:ascii="Times New Roman" w:hAnsi="Times New Roman" w:eastAsia="Calibri" w:cs="Times New Roman" w:eastAsiaTheme="minorHAnsi"/>
+                <w:sz w:val="22"/>
+                <w:szCs w:val="22"/>
+              </w:rPr>
+              <w:t>The UI matches the wireframe, works on a phone and on a computer and meets WCAG 2.2 AA.</w:t>
             </w:r>
           </w:p>
           <w:p>
@@ -524,20 +834,21 @@
                 <w:numId w:val="2"/>
               </w:numPr>
               <w:spacing w:after="80"/>
+              <w:ind w:left="426" w:hanging="426"/>
               <w:jc w:val="both"/>
               <w:rPr>
                 <w:rFonts w:ascii="Times New Roman" w:hAnsi="Times New Roman" w:cs="Times New Roman"/>
-                <w:sz w:val="24"/>
-                <w:szCs w:val="24"/>
-              </w:rPr>
-            </w:pPr>
-            <w:r>
-              <w:rPr>
-                <w:rFonts w:ascii="Times New Roman" w:hAnsi="Times New Roman" w:cs="Times New Roman"/>
-                <w:sz w:val="24"/>
-                <w:szCs w:val="24"/>
-              </w:rPr>
-              <w:t xml:space="preserve">Access rules are checked: a student sees only their own submissions and grades, a lecturer sees only the courses they teach.</w:t>
+                <w:sz w:val="22"/>
+                <w:szCs w:val="22"/>
+              </w:rPr>
+            </w:pPr>
+            <w:r>
+              <w:rPr>
+                <w:rFonts w:ascii="Times New Roman" w:hAnsi="Times New Roman" w:eastAsia="Calibri" w:cs="Times New Roman" w:eastAsiaTheme="minorHAnsi"/>
+                <w:sz w:val="22"/>
+                <w:szCs w:val="22"/>
+              </w:rPr>
+              <w:t>Access rules are checked: a student sees only their own submissions and grades, a lecturer sees only the courses they teach.</w:t>
             </w:r>
           </w:p>
           <w:p>
@@ -547,20 +858,21 @@
                 <w:numId w:val="2"/>
               </w:numPr>
               <w:spacing w:after="80"/>
+              <w:ind w:left="426" w:hanging="426"/>
               <w:jc w:val="both"/>
               <w:rPr>
                 <w:rFonts w:ascii="Times New Roman" w:hAnsi="Times New Roman" w:cs="Times New Roman"/>
-                <w:sz w:val="24"/>
-                <w:szCs w:val="24"/>
-              </w:rPr>
-            </w:pPr>
-            <w:r>
-              <w:rPr>
-                <w:rFonts w:ascii="Times New Roman" w:hAnsi="Times New Roman" w:cs="Times New Roman"/>
-                <w:sz w:val="24"/>
-                <w:szCs w:val="24"/>
-              </w:rPr>
-              <w:t xml:space="preserve">Pages of the story load in ≤ 2 s, and notifications arrive in real time.</w:t>
+                <w:sz w:val="22"/>
+                <w:szCs w:val="22"/>
+              </w:rPr>
+            </w:pPr>
+            <w:r>
+              <w:rPr>
+                <w:rFonts w:ascii="Times New Roman" w:hAnsi="Times New Roman" w:eastAsia="Calibri" w:cs="Times New Roman" w:eastAsiaTheme="minorHAnsi"/>
+                <w:sz w:val="22"/>
+                <w:szCs w:val="22"/>
+              </w:rPr>
+              <w:t>Pages of the story load in ≤ 2 s, and notifications arrive in real time.</w:t>
             </w:r>
           </w:p>
           <w:p>
@@ -570,20 +882,21 @@
                 <w:numId w:val="2"/>
               </w:numPr>
               <w:spacing w:after="80"/>
+              <w:ind w:left="426" w:hanging="426"/>
               <w:jc w:val="both"/>
               <w:rPr>
                 <w:rFonts w:ascii="Times New Roman" w:hAnsi="Times New Roman" w:cs="Times New Roman"/>
-                <w:sz w:val="24"/>
-                <w:szCs w:val="24"/>
-              </w:rPr>
-            </w:pPr>
-            <w:r>
-              <w:rPr>
-                <w:rFonts w:ascii="Times New Roman" w:hAnsi="Times New Roman" w:cs="Times New Roman"/>
-                <w:sz w:val="24"/>
-                <w:szCs w:val="24"/>
-              </w:rPr>
-              <w:t xml:space="preserve">For stories with grades: only the lecturer sets an official grade, and progress is shown as points earned out of the course maximum.</w:t>
+                <w:sz w:val="22"/>
+                <w:szCs w:val="22"/>
+              </w:rPr>
+            </w:pPr>
+            <w:r>
+              <w:rPr>
+                <w:rFonts w:ascii="Times New Roman" w:hAnsi="Times New Roman" w:eastAsia="Calibri" w:cs="Times New Roman" w:eastAsiaTheme="minorHAnsi"/>
+                <w:sz w:val="22"/>
+                <w:szCs w:val="22"/>
+              </w:rPr>
+              <w:t>For stories with grades: only the lecturer sets an official grade, and progress is shown as points earned out of the course maximum.</w:t>
             </w:r>
           </w:p>
           <w:p>
@@ -593,20 +906,21 @@
                 <w:numId w:val="2"/>
               </w:numPr>
               <w:spacing w:after="80"/>
+              <w:ind w:left="426" w:hanging="426"/>
               <w:jc w:val="both"/>
               <w:rPr>
                 <w:rFonts w:ascii="Times New Roman" w:hAnsi="Times New Roman" w:cs="Times New Roman"/>
-                <w:sz w:val="24"/>
-                <w:szCs w:val="24"/>
-              </w:rPr>
-            </w:pPr>
-            <w:r>
-              <w:rPr>
-                <w:rFonts w:ascii="Times New Roman" w:hAnsi="Times New Roman" w:cs="Times New Roman"/>
-                <w:sz w:val="24"/>
-                <w:szCs w:val="24"/>
-              </w:rPr>
-              <w:t xml:space="preserve">All bugs found by QA are fixed, smoke tests pass, and the Product Owner accepts the story.</w:t>
+                <w:sz w:val="22"/>
+                <w:szCs w:val="22"/>
+              </w:rPr>
+            </w:pPr>
+            <w:r>
+              <w:rPr>
+                <w:rFonts w:ascii="Times New Roman" w:hAnsi="Times New Roman" w:eastAsia="Calibri" w:cs="Times New Roman" w:eastAsiaTheme="minorHAnsi"/>
+                <w:sz w:val="22"/>
+                <w:szCs w:val="22"/>
+              </w:rPr>
+              <w:t>All bugs found by QA are fixed, smoke tests pass, and the Product Owner accepts the story.</w:t>
             </w:r>
           </w:p>
         </w:tc>
@@ -621,9 +935,8 @@
       </w:pPr>
     </w:p>
     <w:sectPr>
-      <w:pgSz w:w="12240" w:h="15840" w:orient="portrait"/>
+      <w:pgSz w:w="12240" w:h="15840"/>
       <w:pgMar w:top="1440" w:right="1440" w:bottom="1440" w:left="1440" w:header="720" w:footer="720" w:gutter="0"/>
-      <w:cols w:space="720"/>
       <w:docGrid w:linePitch="360"/>
     </w:sectPr>
   </w:body>

</xml_diff>